<commit_message>
Add asymmetric benchmark table vs hold XST, hold XQQ, and 50/50
</commit_message>
<xml_diff>
--- a/src/historical_asymmetric_theory.docx
+++ b/src/historical_asymmetric_theory.docx
@@ -29,17 +29,19 @@
         <w:tblLook w:firstColumn="1" w:firstRow="1" w:lastColumn="0" w:lastRow="0" w:noHBand="0" w:noVBand="1" w:val="04A0"/>
       </w:tblPr>
       <w:tblGrid>
-        <w:gridCol w:w="1440"/>
-        <w:gridCol w:w="1440"/>
-        <w:gridCol w:w="1440"/>
-        <w:gridCol w:w="1440"/>
-        <w:gridCol w:w="1440"/>
-        <w:gridCol w:w="1440"/>
+        <w:gridCol w:w="1080"/>
+        <w:gridCol w:w="1080"/>
+        <w:gridCol w:w="1080"/>
+        <w:gridCol w:w="1080"/>
+        <w:gridCol w:w="1080"/>
+        <w:gridCol w:w="1080"/>
+        <w:gridCol w:w="1080"/>
+        <w:gridCol w:w="1080"/>
       </w:tblGrid>
       <w:tr>
         <w:tc>
           <w:tcPr>
-            <w:tcW w:type="dxa" w:w="1440"/>
+            <w:tcW w:type="dxa" w:w="1080"/>
           </w:tcPr>
           <w:p>
             <w:r>
@@ -49,7 +51,7 @@
         </w:tc>
         <w:tc>
           <w:tcPr>
-            <w:tcW w:type="dxa" w:w="1440"/>
+            <w:tcW w:type="dxa" w:w="1080"/>
           </w:tcPr>
           <w:p>
             <w:r>
@@ -59,7 +61,7 @@
         </w:tc>
         <w:tc>
           <w:tcPr>
-            <w:tcW w:type="dxa" w:w="1440"/>
+            <w:tcW w:type="dxa" w:w="1080"/>
           </w:tcPr>
           <w:p>
             <w:r>
@@ -69,31 +71,51 @@
         </w:tc>
         <w:tc>
           <w:tcPr>
-            <w:tcW w:type="dxa" w:w="1440"/>
+            <w:tcW w:type="dxa" w:w="1080"/>
           </w:tcPr>
           <w:p>
             <w:r>
-              <w:t>Strategy return %</w:t>
+              <w:t>Asymmetric strategy %</w:t>
             </w:r>
           </w:p>
         </w:tc>
         <w:tc>
           <w:tcPr>
-            <w:tcW w:type="dxa" w:w="1440"/>
+            <w:tcW w:type="dxa" w:w="1080"/>
           </w:tcPr>
           <w:p>
             <w:r>
-              <w:t>50/50 return %</w:t>
+              <w:t>Always XST %</w:t>
             </w:r>
           </w:p>
         </w:tc>
         <w:tc>
           <w:tcPr>
-            <w:tcW w:type="dxa" w:w="1440"/>
+            <w:tcW w:type="dxa" w:w="1080"/>
           </w:tcPr>
           <w:p>
             <w:r>
-              <w:t>Diff vs 50/50 (pp)</w:t>
+              <w:t>Always XQQ %</w:t>
+            </w:r>
+          </w:p>
+        </w:tc>
+        <w:tc>
+          <w:tcPr>
+            <w:tcW w:type="dxa" w:w="1080"/>
+          </w:tcPr>
+          <w:p>
+            <w:r>
+              <w:t>50/50 %</w:t>
+            </w:r>
+          </w:p>
+        </w:tc>
+        <w:tc>
+          <w:tcPr>
+            <w:tcW w:type="dxa" w:w="1080"/>
+          </w:tcPr>
+          <w:p>
+            <w:r>
+              <w:t>Edge vs 50/50 (pp)</w:t>
             </w:r>
           </w:p>
         </w:tc>
@@ -101,7 +123,7 @@
       <w:tr>
         <w:tc>
           <w:tcPr>
-            <w:tcW w:type="dxa" w:w="1440"/>
+            <w:tcW w:type="dxa" w:w="1080"/>
           </w:tcPr>
           <w:p>
             <w:r>
@@ -111,7 +133,7 @@
         </w:tc>
         <w:tc>
           <w:tcPr>
-            <w:tcW w:type="dxa" w:w="1440"/>
+            <w:tcW w:type="dxa" w:w="1080"/>
           </w:tcPr>
           <w:p>
             <w:r>
@@ -121,7 +143,7 @@
         </w:tc>
         <w:tc>
           <w:tcPr>
-            <w:tcW w:type="dxa" w:w="1440"/>
+            <w:tcW w:type="dxa" w:w="1080"/>
           </w:tcPr>
           <w:p>
             <w:r>
@@ -131,7 +153,7 @@
         </w:tc>
         <w:tc>
           <w:tcPr>
-            <w:tcW w:type="dxa" w:w="1440"/>
+            <w:tcW w:type="dxa" w:w="1080"/>
           </w:tcPr>
           <w:p>
             <w:r>
@@ -141,7 +163,27 @@
         </w:tc>
         <w:tc>
           <w:tcPr>
-            <w:tcW w:type="dxa" w:w="1440"/>
+            <w:tcW w:type="dxa" w:w="1080"/>
+          </w:tcPr>
+          <w:p>
+            <w:r>
+              <w:t>27.07%</w:t>
+            </w:r>
+          </w:p>
+        </w:tc>
+        <w:tc>
+          <w:tcPr>
+            <w:tcW w:type="dxa" w:w="1080"/>
+          </w:tcPr>
+          <w:p>
+            <w:r>
+              <w:t>38.60%</w:t>
+            </w:r>
+          </w:p>
+        </w:tc>
+        <w:tc>
+          <w:tcPr>
+            <w:tcW w:type="dxa" w:w="1080"/>
           </w:tcPr>
           <w:p>
             <w:r>
@@ -151,7 +193,7 @@
         </w:tc>
         <w:tc>
           <w:tcPr>
-            <w:tcW w:type="dxa" w:w="1440"/>
+            <w:tcW w:type="dxa" w:w="1080"/>
           </w:tcPr>
           <w:p>
             <w:r>
@@ -163,7 +205,7 @@
       <w:tr>
         <w:tc>
           <w:tcPr>
-            <w:tcW w:type="dxa" w:w="1440"/>
+            <w:tcW w:type="dxa" w:w="1080"/>
           </w:tcPr>
           <w:p>
             <w:r>
@@ -173,7 +215,7 @@
         </w:tc>
         <w:tc>
           <w:tcPr>
-            <w:tcW w:type="dxa" w:w="1440"/>
+            <w:tcW w:type="dxa" w:w="1080"/>
           </w:tcPr>
           <w:p>
             <w:r>
@@ -183,7 +225,7 @@
         </w:tc>
         <w:tc>
           <w:tcPr>
-            <w:tcW w:type="dxa" w:w="1440"/>
+            <w:tcW w:type="dxa" w:w="1080"/>
           </w:tcPr>
           <w:p>
             <w:r>
@@ -193,7 +235,7 @@
         </w:tc>
         <w:tc>
           <w:tcPr>
-            <w:tcW w:type="dxa" w:w="1440"/>
+            <w:tcW w:type="dxa" w:w="1080"/>
           </w:tcPr>
           <w:p>
             <w:r>
@@ -203,7 +245,27 @@
         </w:tc>
         <w:tc>
           <w:tcPr>
-            <w:tcW w:type="dxa" w:w="1440"/>
+            <w:tcW w:type="dxa" w:w="1080"/>
+          </w:tcPr>
+          <w:p>
+            <w:r>
+              <w:t>77.99%</w:t>
+            </w:r>
+          </w:p>
+        </w:tc>
+        <w:tc>
+          <w:tcPr>
+            <w:tcW w:type="dxa" w:w="1080"/>
+          </w:tcPr>
+          <w:p>
+            <w:r>
+              <w:t>77.20%</w:t>
+            </w:r>
+          </w:p>
+        </w:tc>
+        <w:tc>
+          <w:tcPr>
+            <w:tcW w:type="dxa" w:w="1080"/>
           </w:tcPr>
           <w:p>
             <w:r>
@@ -213,7 +275,7 @@
         </w:tc>
         <w:tc>
           <w:tcPr>
-            <w:tcW w:type="dxa" w:w="1440"/>
+            <w:tcW w:type="dxa" w:w="1080"/>
           </w:tcPr>
           <w:p>
             <w:r>

</xml_diff>